<commit_message>
feat: templates DOCX refaits — fideles aux PDFs
- Footer avec ligne decorative rose + infos NJM
- Image cachet/signature dans convention, attestation, contrat, feuille presence
- Tailles de police corrigees pour correspondre aux PDFs
- Bordure orange autour du titre formation dans attestation
- Notice rose "Document a conserver" dans attestation
- Feuille presence : signature dans colonnes Matin/Apres-midi

Co-Authored-By: Claude Opus 4.6 (1M context) <noreply@anthropic.com>
</commit_message>
<xml_diff>
--- a/templates/attestation_template.docx
+++ b/templates/attestation_template.docx
@@ -6,7 +6,7 @@
       <w:r>
         <w:drawing>
           <wp:inline distT="0" distB="0" distL="0" distR="0">
-            <wp:extent cx="1238250" cy="714375"/>
+            <wp:extent cx="952500" cy="552450"/>
             <wp:effectExtent t="0" r="0" b="0" l="0"/>
             <wp:docPr id="1" name="" descr="" title=""/>
             <wp:cNvGraphicFramePr>
@@ -31,7 +31,7 @@
                   <pic:spPr bwMode="auto">
                     <a:xfrm>
                       <a:off x="0" y="0"/>
-                      <a:ext cx="1238250" cy="714375"/>
+                      <a:ext cx="952500" cy="552450"/>
                     </a:xfrm>
                     <a:prstGeom prst="rect">
                       <a:avLst/>
@@ -51,7 +51,7 @@
       </w:pPr>
       <w:r>
         <w:rPr>
-          <w:rFonts w:ascii="Arial" w:cs="Arial" w:eastAsia="Arial" w:hAnsi="Arial"/>
+          <w:rFonts w:ascii="Helvetica" w:cs="Helvetica" w:eastAsia="Helvetica" w:hAnsi="Helvetica"/>
           <w:b/>
           <w:bCs/>
           <w:color w:val="E36A3A"/>
@@ -67,7 +67,7 @@
       </w:pPr>
       <w:r>
         <w:rPr>
-          <w:rFonts w:ascii="Arial" w:cs="Arial" w:eastAsia="Arial" w:hAnsi="Arial"/>
+          <w:rFonts w:ascii="Helvetica" w:cs="Helvetica" w:eastAsia="Helvetica" w:hAnsi="Helvetica"/>
           <w:b/>
           <w:bCs/>
           <w:color w:val="E36A3A"/>
@@ -83,7 +83,7 @@
       </w:pPr>
       <w:r>
         <w:rPr>
-          <w:rFonts w:ascii="Arial" w:cs="Arial" w:eastAsia="Arial" w:hAnsi="Arial"/>
+          <w:rFonts w:ascii="Helvetica" w:cs="Helvetica" w:eastAsia="Helvetica" w:hAnsi="Helvetica"/>
           <w:b/>
           <w:bCs/>
           <w:color w:val="E36A3A"/>
@@ -99,7 +99,7 @@
       </w:pPr>
       <w:r>
         <w:rPr>
-          <w:rFonts w:ascii="Arial" w:cs="Arial" w:eastAsia="Arial" w:hAnsi="Arial"/>
+          <w:rFonts w:ascii="Helvetica" w:cs="Helvetica" w:eastAsia="Helvetica" w:hAnsi="Helvetica"/>
           <w:b/>
           <w:bCs/>
           <w:color w:val="E36A3A"/>
@@ -111,12 +111,12 @@
     </w:p>
     <w:p>
       <w:pPr>
-        <w:spacing w:after="200"/>
+        <w:spacing w:after="150"/>
         <w:jc w:val="right"/>
       </w:pPr>
       <w:r>
         <w:rPr>
-          <w:rFonts w:ascii="Arial" w:cs="Arial" w:eastAsia="Arial" w:hAnsi="Arial"/>
+          <w:rFonts w:ascii="Helvetica" w:cs="Helvetica" w:eastAsia="Helvetica" w:hAnsi="Helvetica"/>
           <w:b/>
           <w:bCs/>
           <w:color w:val="E36A3A"/>
@@ -128,12 +128,12 @@
     </w:p>
     <w:p>
       <w:pPr>
-        <w:spacing w:after="200" w:before="200"/>
+        <w:spacing w:after="150" w:before="150"/>
         <w:jc w:val="center"/>
       </w:pPr>
       <w:r>
         <w:rPr>
-          <w:rFonts w:ascii="Arial" w:cs="Arial" w:eastAsia="Arial" w:hAnsi="Arial"/>
+          <w:rFonts w:ascii="Helvetica" w:cs="Helvetica" w:eastAsia="Helvetica" w:hAnsi="Helvetica"/>
           <w:b/>
           <w:bCs/>
           <w:color w:val="333333"/>
@@ -149,7 +149,7 @@
       </w:pPr>
       <w:r>
         <w:rPr>
-          <w:rFonts w:ascii="Arial" w:cs="Arial" w:eastAsia="Arial" w:hAnsi="Arial"/>
+          <w:rFonts w:ascii="Helvetica" w:cs="Helvetica" w:eastAsia="Helvetica" w:hAnsi="Helvetica"/>
           <w:color w:val="333333"/>
           <w:sz w:val="18"/>
           <w:szCs w:val="18"/>
@@ -159,11 +159,11 @@
     </w:p>
     <w:p>
       <w:pPr>
-        <w:spacing w:after="80"/>
-      </w:pPr>
-      <w:r>
-        <w:rPr>
-          <w:rFonts w:ascii="Arial" w:cs="Arial" w:eastAsia="Arial" w:hAnsi="Arial"/>
+        <w:spacing w:after="60"/>
+      </w:pPr>
+      <w:r>
+        <w:rPr>
+          <w:rFonts w:ascii="Helvetica" w:cs="Helvetica" w:eastAsia="Helvetica" w:hAnsi="Helvetica"/>
           <w:color w:val="333333"/>
           <w:sz w:val="18"/>
           <w:szCs w:val="18"/>
@@ -173,11 +173,11 @@
     </w:p>
     <w:p>
       <w:pPr>
-        <w:spacing w:after="40"/>
-      </w:pPr>
-      <w:r>
-        <w:rPr>
-          <w:rFonts w:ascii="Arial" w:cs="Arial" w:eastAsia="Arial" w:hAnsi="Arial"/>
+        <w:spacing w:after="30"/>
+      </w:pPr>
+      <w:r>
+        <w:rPr>
+          <w:rFonts w:ascii="Helvetica" w:cs="Helvetica" w:eastAsia="Helvetica" w:hAnsi="Helvetica"/>
           <w:b/>
           <w:bCs/>
           <w:color w:val="333333"/>
@@ -189,11 +189,11 @@
     </w:p>
     <w:p>
       <w:pPr>
-        <w:spacing w:after="80"/>
-      </w:pPr>
-      <w:r>
-        <w:rPr>
-          <w:rFonts w:ascii="Arial" w:cs="Arial" w:eastAsia="Arial" w:hAnsi="Arial"/>
+        <w:spacing w:after="60"/>
+      </w:pPr>
+      <w:r>
+        <w:rPr>
+          <w:rFonts w:ascii="Helvetica" w:cs="Helvetica" w:eastAsia="Helvetica" w:hAnsi="Helvetica"/>
           <w:color w:val="333333"/>
           <w:sz w:val="18"/>
           <w:szCs w:val="18"/>
@@ -203,11 +203,11 @@
     </w:p>
     <w:p>
       <w:pPr>
-        <w:spacing w:after="40"/>
-      </w:pPr>
-      <w:r>
-        <w:rPr>
-          <w:rFonts w:ascii="Arial" w:cs="Arial" w:eastAsia="Arial" w:hAnsi="Arial"/>
+        <w:spacing w:after="30"/>
+      </w:pPr>
+      <w:r>
+        <w:rPr>
+          <w:rFonts w:ascii="Helvetica" w:cs="Helvetica" w:eastAsia="Helvetica" w:hAnsi="Helvetica"/>
           <w:color w:val="333333"/>
           <w:sz w:val="18"/>
           <w:szCs w:val="18"/>
@@ -217,12 +217,12 @@
     </w:p>
     <w:p>
       <w:pPr>
-        <w:spacing w:after="20"/>
+        <w:spacing w:after="15"/>
         <w:ind w:left="283"/>
       </w:pPr>
       <w:r>
         <w:rPr>
-          <w:rFonts w:ascii="Arial" w:cs="Arial" w:eastAsia="Arial" w:hAnsi="Arial"/>
+          <w:rFonts w:ascii="Helvetica" w:cs="Helvetica" w:eastAsia="Helvetica" w:hAnsi="Helvetica"/>
           <w:color w:val="333333"/>
           <w:sz w:val="18"/>
           <w:szCs w:val="18"/>
@@ -232,12 +232,12 @@
     </w:p>
     <w:p>
       <w:pPr>
-        <w:spacing w:after="80"/>
+        <w:spacing w:after="60"/>
         <w:ind w:left="283"/>
       </w:pPr>
       <w:r>
         <w:rPr>
-          <w:rFonts w:ascii="Arial" w:cs="Arial" w:eastAsia="Arial" w:hAnsi="Arial"/>
+          <w:rFonts w:ascii="Helvetica" w:cs="Helvetica" w:eastAsia="Helvetica" w:hAnsi="Helvetica"/>
           <w:color w:val="333333"/>
           <w:sz w:val="18"/>
           <w:szCs w:val="18"/>
@@ -247,11 +247,11 @@
     </w:p>
     <w:p>
       <w:pPr>
-        <w:spacing w:after="40"/>
-      </w:pPr>
-      <w:r>
-        <w:rPr>
-          <w:rFonts w:ascii="Arial" w:cs="Arial" w:eastAsia="Arial" w:hAnsi="Arial"/>
+        <w:spacing w:after="30"/>
+      </w:pPr>
+      <w:r>
+        <w:rPr>
+          <w:rFonts w:ascii="Helvetica" w:cs="Helvetica" w:eastAsia="Helvetica" w:hAnsi="Helvetica"/>
           <w:color w:val="333333"/>
           <w:sz w:val="18"/>
           <w:szCs w:val="18"/>
@@ -261,11 +261,11 @@
     </w:p>
     <w:p>
       <w:pPr>
-        <w:spacing w:after="120"/>
-      </w:pPr>
-      <w:r>
-        <w:rPr>
-          <w:rFonts w:ascii="Arial" w:cs="Arial" w:eastAsia="Arial" w:hAnsi="Arial"/>
+        <w:spacing w:after="100"/>
+      </w:pPr>
+      <w:r>
+        <w:rPr>
+          <w:rFonts w:ascii="Helvetica" w:cs="Helvetica" w:eastAsia="Helvetica" w:hAnsi="Helvetica"/>
           <w:color w:val="333333"/>
           <w:sz w:val="18"/>
           <w:szCs w:val="18"/>
@@ -275,12 +275,12 @@
     </w:p>
     <w:p>
       <w:pPr>
-        <w:spacing w:after="120"/>
+        <w:spacing w:after="100"/>
         <w:jc w:val="right"/>
       </w:pPr>
       <w:r>
         <w:rPr>
-          <w:rFonts w:ascii="Arial" w:cs="Arial" w:eastAsia="Arial" w:hAnsi="Arial"/>
+          <w:rFonts w:ascii="Helvetica" w:cs="Helvetica" w:eastAsia="Helvetica" w:hAnsi="Helvetica"/>
           <w:color w:val="333333"/>
           <w:sz w:val="18"/>
           <w:szCs w:val="18"/>
@@ -290,12 +290,12 @@
     </w:p>
     <w:p>
       <w:pPr>
-        <w:spacing w:after="40"/>
+        <w:spacing w:after="30"/>
         <w:jc w:val="center"/>
       </w:pPr>
       <w:r>
         <w:rPr>
-          <w:rFonts w:ascii="Arial" w:cs="Arial" w:eastAsia="Arial" w:hAnsi="Arial"/>
+          <w:rFonts w:ascii="Helvetica" w:cs="Helvetica" w:eastAsia="Helvetica" w:hAnsi="Helvetica"/>
           <w:color w:val="333333"/>
           <w:sz w:val="18"/>
           <w:szCs w:val="18"/>
@@ -305,16 +305,62 @@
     </w:p>
     <w:p>
       <w:pPr>
+        <w:spacing w:after="10"/>
         <w:jc w:val="center"/>
       </w:pPr>
       <w:r>
         <w:rPr>
-          <w:rFonts w:ascii="Arial" w:cs="Arial" w:eastAsia="Arial" w:hAnsi="Arial"/>
+          <w:rFonts w:ascii="Helvetica" w:cs="Helvetica" w:eastAsia="Helvetica" w:hAnsi="Helvetica"/>
           <w:color w:val="333333"/>
           <w:sz w:val="18"/>
           <w:szCs w:val="18"/>
         </w:rPr>
         <w:t xml:space="preserve">Nathalie JOULIE MORAND</w:t>
+      </w:r>
+    </w:p>
+    <w:p>
+      <w:pPr>
+        <w:jc w:val="center"/>
+      </w:pPr>
+      <w:r>
+        <w:drawing>
+          <wp:inline distT="0" distB="0" distL="0" distR="0">
+            <wp:extent cx="952500" cy="666750"/>
+            <wp:effectExtent t="0" r="0" b="0" l="0"/>
+            <wp:docPr id="1" name="" descr="" title=""/>
+            <wp:cNvGraphicFramePr>
+              <a:graphicFrameLocks xmlns:a="http://schemas.openxmlformats.org/drawingml/2006/main" noChangeAspect="1"/>
+            </wp:cNvGraphicFramePr>
+            <a:graphic xmlns:a="http://schemas.openxmlformats.org/drawingml/2006/main">
+              <a:graphicData uri="http://schemas.openxmlformats.org/drawingml/2006/picture">
+                <pic:pic xmlns:pic="http://schemas.openxmlformats.org/drawingml/2006/picture">
+                  <pic:nvPicPr>
+                    <pic:cNvPr id="0" name="" descr=""/>
+                    <pic:cNvPicPr>
+                      <a:picLocks noChangeAspect="1" noChangeArrowheads="1"/>
+                    </pic:cNvPicPr>
+                  </pic:nvPicPr>
+                  <pic:blipFill>
+                    <a:blip r:embed="rId10" cstate="none"/>
+                    <a:srcRect/>
+                    <a:stretch>
+                      <a:fillRect/>
+                    </a:stretch>
+                  </pic:blipFill>
+                  <pic:spPr bwMode="auto">
+                    <a:xfrm>
+                      <a:off x="0" y="0"/>
+                      <a:ext cx="952500" cy="666750"/>
+                    </a:xfrm>
+                    <a:prstGeom prst="rect">
+                      <a:avLst/>
+                    </a:prstGeom>
+                  </pic:spPr>
+                </pic:pic>
+              </a:graphicData>
+            </a:graphic>
+          </wp:inline>
+        </w:drawing>
       </w:r>
     </w:p>
     <w:p>
@@ -332,7 +378,7 @@
       <w:r>
         <w:drawing>
           <wp:inline distT="0" distB="0" distL="0" distR="0">
-            <wp:extent cx="1238250" cy="714375"/>
+            <wp:extent cx="952500" cy="552450"/>
             <wp:effectExtent t="0" r="0" b="0" l="0"/>
             <wp:docPr id="1" name="" descr="" title=""/>
             <wp:cNvGraphicFramePr>
@@ -357,7 +403,7 @@
                   <pic:spPr bwMode="auto">
                     <a:xfrm>
                       <a:off x="0" y="0"/>
-                      <a:ext cx="1238250" cy="714375"/>
+                      <a:ext cx="952500" cy="552450"/>
                     </a:xfrm>
                     <a:prstGeom prst="rect">
                       <a:avLst/>
@@ -377,7 +423,7 @@
       </w:pPr>
       <w:r>
         <w:rPr>
-          <w:rFonts w:ascii="Arial" w:cs="Arial" w:eastAsia="Arial" w:hAnsi="Arial"/>
+          <w:rFonts w:ascii="Helvetica" w:cs="Helvetica" w:eastAsia="Helvetica" w:hAnsi="Helvetica"/>
           <w:b/>
           <w:bCs/>
           <w:color w:val="E36A3A"/>
@@ -393,7 +439,7 @@
       </w:pPr>
       <w:r>
         <w:rPr>
-          <w:rFonts w:ascii="Arial" w:cs="Arial" w:eastAsia="Arial" w:hAnsi="Arial"/>
+          <w:rFonts w:ascii="Helvetica" w:cs="Helvetica" w:eastAsia="Helvetica" w:hAnsi="Helvetica"/>
           <w:b/>
           <w:bCs/>
           <w:color w:val="E36A3A"/>
@@ -409,7 +455,7 @@
       </w:pPr>
       <w:r>
         <w:rPr>
-          <w:rFonts w:ascii="Arial" w:cs="Arial" w:eastAsia="Arial" w:hAnsi="Arial"/>
+          <w:rFonts w:ascii="Helvetica" w:cs="Helvetica" w:eastAsia="Helvetica" w:hAnsi="Helvetica"/>
           <w:b/>
           <w:bCs/>
           <w:color w:val="E36A3A"/>
@@ -425,7 +471,7 @@
       </w:pPr>
       <w:r>
         <w:rPr>
-          <w:rFonts w:ascii="Arial" w:cs="Arial" w:eastAsia="Arial" w:hAnsi="Arial"/>
+          <w:rFonts w:ascii="Helvetica" w:cs="Helvetica" w:eastAsia="Helvetica" w:hAnsi="Helvetica"/>
           <w:b/>
           <w:bCs/>
           <w:color w:val="E36A3A"/>
@@ -437,12 +483,12 @@
     </w:p>
     <w:p>
       <w:pPr>
-        <w:spacing w:after="200"/>
+        <w:spacing w:after="150"/>
         <w:jc w:val="right"/>
       </w:pPr>
       <w:r>
         <w:rPr>
-          <w:rFonts w:ascii="Arial" w:cs="Arial" w:eastAsia="Arial" w:hAnsi="Arial"/>
+          <w:rFonts w:ascii="Helvetica" w:cs="Helvetica" w:eastAsia="Helvetica" w:hAnsi="Helvetica"/>
           <w:b/>
           <w:bCs/>
           <w:color w:val="E36A3A"/>
@@ -454,12 +500,12 @@
     </w:p>
     <w:p>
       <w:pPr>
-        <w:spacing w:after="60" w:before="200"/>
+        <w:spacing w:after="40" w:before="150"/>
         <w:jc w:val="center"/>
       </w:pPr>
       <w:r>
         <w:rPr>
-          <w:rFonts w:ascii="Arial" w:cs="Arial" w:eastAsia="Arial" w:hAnsi="Arial"/>
+          <w:rFonts w:ascii="Helvetica" w:cs="Helvetica" w:eastAsia="Helvetica" w:hAnsi="Helvetica"/>
           <w:b/>
           <w:bCs/>
           <w:color w:val="E36A3A"/>
@@ -471,12 +517,12 @@
     </w:p>
     <w:p>
       <w:pPr>
-        <w:spacing w:after="120"/>
+        <w:spacing w:after="80"/>
         <w:jc w:val="center"/>
       </w:pPr>
       <w:r>
         <w:rPr>
-          <w:rFonts w:ascii="Arial" w:cs="Arial" w:eastAsia="Arial" w:hAnsi="Arial"/>
+          <w:rFonts w:ascii="Helvetica" w:cs="Helvetica" w:eastAsia="Helvetica" w:hAnsi="Helvetica"/>
           <w:color w:val="6B7280"/>
           <w:sz w:val="16"/>
           <w:szCs w:val="16"/>
@@ -486,11 +532,11 @@
     </w:p>
     <w:p>
       <w:pPr>
-        <w:spacing w:after="60"/>
-      </w:pPr>
-      <w:r>
-        <w:rPr>
-          <w:rFonts w:ascii="Arial" w:cs="Arial" w:eastAsia="Arial" w:hAnsi="Arial"/>
+        <w:spacing w:after="40"/>
+      </w:pPr>
+      <w:r>
+        <w:rPr>
+          <w:rFonts w:ascii="Helvetica" w:cs="Helvetica" w:eastAsia="Helvetica" w:hAnsi="Helvetica"/>
           <w:color w:val="333333"/>
           <w:sz w:val="18"/>
           <w:szCs w:val="18"/>
@@ -500,11 +546,11 @@
     </w:p>
     <w:p>
       <w:pPr>
-        <w:spacing w:after="60"/>
-      </w:pPr>
-      <w:r>
-        <w:rPr>
-          <w:rFonts w:ascii="Arial" w:cs="Arial" w:eastAsia="Arial" w:hAnsi="Arial"/>
+        <w:spacing w:after="40"/>
+      </w:pPr>
+      <w:r>
+        <w:rPr>
+          <w:rFonts w:ascii="Helvetica" w:cs="Helvetica" w:eastAsia="Helvetica" w:hAnsi="Helvetica"/>
           <w:color w:val="333333"/>
           <w:sz w:val="18"/>
           <w:szCs w:val="18"/>
@@ -514,11 +560,11 @@
     </w:p>
     <w:p>
       <w:pPr>
-        <w:spacing w:after="60"/>
-      </w:pPr>
-      <w:r>
-        <w:rPr>
-          <w:rFonts w:ascii="Arial" w:cs="Arial" w:eastAsia="Arial" w:hAnsi="Arial"/>
+        <w:spacing w:after="40"/>
+      </w:pPr>
+      <w:r>
+        <w:rPr>
+          <w:rFonts w:ascii="Helvetica" w:cs="Helvetica" w:eastAsia="Helvetica" w:hAnsi="Helvetica"/>
           <w:color w:val="333333"/>
           <w:sz w:val="18"/>
           <w:szCs w:val="18"/>
@@ -528,12 +574,18 @@
     </w:p>
     <w:p>
       <w:pPr>
-        <w:spacing w:after="120" w:before="60"/>
+        <w:pBdr>
+          <w:top w:val="single" w:color="E36A3A" w:sz="6" w:space="4"/>
+          <w:bottom w:val="single" w:color="E36A3A" w:sz="6" w:space="4"/>
+          <w:left w:val="single" w:color="E36A3A" w:sz="6" w:space="6"/>
+          <w:right w:val="single" w:color="E36A3A" w:sz="6" w:space="6"/>
+        </w:pBdr>
+        <w:spacing w:after="80" w:before="40"/>
         <w:jc w:val="center"/>
       </w:pPr>
       <w:r>
         <w:rPr>
-          <w:rFonts w:ascii="Arial" w:cs="Arial" w:eastAsia="Arial" w:hAnsi="Arial"/>
+          <w:rFonts w:ascii="Helvetica" w:cs="Helvetica" w:eastAsia="Helvetica" w:hAnsi="Helvetica"/>
           <w:b/>
           <w:bCs/>
           <w:color w:val="E36A3A"/>
@@ -545,11 +597,10 @@
     </w:p>
     <w:p>
       <w:pPr>
-        <w:spacing w:after="20"/>
-      </w:pPr>
-      <w:r>
-        <w:rPr>
-          <w:rFonts w:ascii="Arial" w:cs="Arial" w:eastAsia="Arial" w:hAnsi="Arial"/>
+        <w:spacing w:after="15"/>
+      </w:pPr>
+      <w:r>
+        <w:rPr>
           <w:color w:val="333333"/>
           <w:sz w:val="18"/>
           <w:szCs w:val="18"/>
@@ -558,7 +609,7 @@
       </w:r>
       <w:r>
         <w:rPr>
-          <w:rFonts w:ascii="Arial" w:cs="Arial" w:eastAsia="Arial" w:hAnsi="Arial"/>
+          <w:rFonts w:ascii="Helvetica" w:cs="Helvetica" w:eastAsia="Helvetica" w:hAnsi="Helvetica"/>
           <w:color w:val="333333"/>
           <w:sz w:val="18"/>
           <w:szCs w:val="18"/>
@@ -573,7 +624,7 @@
       </w:pPr>
       <w:r>
         <w:rPr>
-          <w:rFonts w:ascii="Arial" w:cs="Arial" w:eastAsia="Arial" w:hAnsi="Arial"/>
+          <w:rFonts w:ascii="Helvetica" w:cs="Helvetica" w:eastAsia="Helvetica" w:hAnsi="Helvetica"/>
           <w:color w:val="333333"/>
           <w:sz w:val="18"/>
           <w:szCs w:val="18"/>
@@ -583,16 +634,15 @@
     </w:p>
     <w:p>
       <w:pPr>
-        <w:spacing w:after="40"/>
-      </w:pPr>
-    </w:p>
-    <w:p>
-      <w:pPr>
-        <w:spacing w:after="20"/>
-      </w:pPr>
-      <w:r>
-        <w:rPr>
-          <w:rFonts w:ascii="Arial" w:cs="Arial" w:eastAsia="Arial" w:hAnsi="Arial"/>
+        <w:spacing w:after="30"/>
+      </w:pPr>
+    </w:p>
+    <w:p>
+      <w:pPr>
+        <w:spacing w:after="15"/>
+      </w:pPr>
+      <w:r>
+        <w:rPr>
           <w:color w:val="333333"/>
           <w:sz w:val="18"/>
           <w:szCs w:val="18"/>
@@ -601,7 +651,7 @@
       </w:r>
       <w:r>
         <w:rPr>
-          <w:rFonts w:ascii="Arial" w:cs="Arial" w:eastAsia="Arial" w:hAnsi="Arial"/>
+          <w:rFonts w:ascii="Helvetica" w:cs="Helvetica" w:eastAsia="Helvetica" w:hAnsi="Helvetica"/>
           <w:color w:val="333333"/>
           <w:sz w:val="18"/>
           <w:szCs w:val="18"/>
@@ -611,12 +661,12 @@
     </w:p>
     <w:p>
       <w:pPr>
-        <w:spacing w:after="20"/>
+        <w:spacing w:after="15"/>
         <w:ind w:left="283"/>
       </w:pPr>
       <w:r>
         <w:rPr>
-          <w:rFonts w:ascii="Arial" w:cs="Arial" w:eastAsia="Arial" w:hAnsi="Arial"/>
+          <w:rFonts w:ascii="Helvetica" w:cs="Helvetica" w:eastAsia="Helvetica" w:hAnsi="Helvetica"/>
           <w:color w:val="333333"/>
           <w:sz w:val="18"/>
           <w:szCs w:val="18"/>
@@ -626,12 +676,12 @@
     </w:p>
     <w:p>
       <w:pPr>
-        <w:spacing w:after="40"/>
+        <w:spacing w:after="30"/>
         <w:ind w:left="283"/>
       </w:pPr>
       <w:r>
         <w:rPr>
-          <w:rFonts w:ascii="Arial" w:cs="Arial" w:eastAsia="Arial" w:hAnsi="Arial"/>
+          <w:rFonts w:ascii="Helvetica" w:cs="Helvetica" w:eastAsia="Helvetica" w:hAnsi="Helvetica"/>
           <w:color w:val="333333"/>
           <w:sz w:val="18"/>
           <w:szCs w:val="18"/>
@@ -641,11 +691,10 @@
     </w:p>
     <w:p>
       <w:pPr>
-        <w:spacing w:after="20"/>
-      </w:pPr>
-      <w:r>
-        <w:rPr>
-          <w:rFonts w:ascii="Arial" w:cs="Arial" w:eastAsia="Arial" w:hAnsi="Arial"/>
+        <w:spacing w:after="15"/>
+      </w:pPr>
+      <w:r>
+        <w:rPr>
           <w:color w:val="333333"/>
           <w:sz w:val="18"/>
           <w:szCs w:val="18"/>
@@ -654,7 +703,7 @@
       </w:r>
       <w:r>
         <w:rPr>
-          <w:rFonts w:ascii="Arial" w:cs="Arial" w:eastAsia="Arial" w:hAnsi="Arial"/>
+          <w:rFonts w:ascii="Helvetica" w:cs="Helvetica" w:eastAsia="Helvetica" w:hAnsi="Helvetica"/>
           <w:color w:val="333333"/>
           <w:sz w:val="18"/>
           <w:szCs w:val="18"/>
@@ -669,7 +718,7 @@
       </w:pPr>
       <w:r>
         <w:rPr>
-          <w:rFonts w:ascii="Arial" w:cs="Arial" w:eastAsia="Arial" w:hAnsi="Arial"/>
+          <w:rFonts w:ascii="Helvetica" w:cs="Helvetica" w:eastAsia="Helvetica" w:hAnsi="Helvetica"/>
           <w:color w:val="333333"/>
           <w:sz w:val="18"/>
           <w:szCs w:val="18"/>
@@ -684,7 +733,7 @@
       </w:pPr>
       <w:r>
         <w:rPr>
-          <w:rFonts w:ascii="Arial" w:cs="Arial" w:eastAsia="Arial" w:hAnsi="Arial"/>
+          <w:rFonts w:ascii="Helvetica" w:cs="Helvetica" w:eastAsia="Helvetica" w:hAnsi="Helvetica"/>
           <w:color w:val="333333"/>
           <w:sz w:val="18"/>
           <w:szCs w:val="18"/>
@@ -694,16 +743,15 @@
     </w:p>
     <w:p>
       <w:pPr>
+        <w:spacing w:after="30"/>
+      </w:pPr>
+    </w:p>
+    <w:p>
+      <w:pPr>
         <w:spacing w:after="40"/>
       </w:pPr>
-    </w:p>
-    <w:p>
-      <w:pPr>
-        <w:spacing w:after="40"/>
-      </w:pPr>
-      <w:r>
-        <w:rPr>
-          <w:rFonts w:ascii="Arial" w:cs="Arial" w:eastAsia="Arial" w:hAnsi="Arial"/>
+      <w:r>
+        <w:rPr>
           <w:color w:val="333333"/>
           <w:sz w:val="18"/>
           <w:szCs w:val="18"/>
@@ -712,7 +760,7 @@
       </w:r>
       <w:r>
         <w:rPr>
-          <w:rFonts w:ascii="Arial" w:cs="Arial" w:eastAsia="Arial" w:hAnsi="Arial"/>
+          <w:rFonts w:ascii="Helvetica" w:cs="Helvetica" w:eastAsia="Helvetica" w:hAnsi="Helvetica"/>
           <w:color w:val="333333"/>
           <w:sz w:val="18"/>
           <w:szCs w:val="18"/>
@@ -722,27 +770,27 @@
     </w:p>
     <w:p>
       <w:pPr>
+        <w:spacing w:after="60"/>
+        <w:ind w:left="283"/>
+      </w:pPr>
+      <w:r>
+        <w:rPr>
+          <w:rFonts w:ascii="Helvetica" w:cs="Helvetica" w:eastAsia="Helvetica" w:hAnsi="Helvetica"/>
+          <w:color w:val="333333"/>
+          <w:sz w:val="18"/>
+          <w:szCs w:val="18"/>
+        </w:rPr>
+        <w:t xml:space="preserve">{{objectives}}</w:t>
+      </w:r>
+    </w:p>
+    <w:p>
+      <w:pPr>
         <w:spacing w:after="80"/>
-        <w:ind w:left="283"/>
-      </w:pPr>
-      <w:r>
-        <w:rPr>
-          <w:rFonts w:ascii="Arial" w:cs="Arial" w:eastAsia="Arial" w:hAnsi="Arial"/>
-          <w:color w:val="333333"/>
-          <w:sz w:val="18"/>
-          <w:szCs w:val="18"/>
-        </w:rPr>
-        <w:t xml:space="preserve">{{objectives}}</w:t>
-      </w:r>
-    </w:p>
-    <w:p>
-      <w:pPr>
-        <w:spacing w:after="120"/>
         <w:jc w:val="right"/>
       </w:pPr>
       <w:r>
         <w:rPr>
-          <w:rFonts w:ascii="Arial" w:cs="Arial" w:eastAsia="Arial" w:hAnsi="Arial"/>
+          <w:rFonts w:ascii="Helvetica" w:cs="Helvetica" w:eastAsia="Helvetica" w:hAnsi="Helvetica"/>
           <w:color w:val="333333"/>
           <w:sz w:val="18"/>
           <w:szCs w:val="18"/>
@@ -751,31 +799,103 @@
       </w:r>
     </w:p>
     <w:p>
-      <w:pPr>
+      <w:r>
+        <w:rPr>
+          <w:rFonts w:ascii="Helvetica" w:cs="Helvetica" w:eastAsia="Helvetica" w:hAnsi="Helvetica"/>
+          <w:color w:val="333333"/>
+          <w:sz w:val="18"/>
+          <w:szCs w:val="18"/>
+        </w:rPr>
+        <w:t xml:space="preserve">La formatrice et directrice de</w:t>
+      </w:r>
+    </w:p>
+    <w:p>
+      <w:r>
+        <w:rPr>
+          <w:rFonts w:ascii="Helvetica" w:cs="Helvetica" w:eastAsia="Helvetica" w:hAnsi="Helvetica"/>
+          <w:color w:val="333333"/>
+          <w:sz w:val="18"/>
+          <w:szCs w:val="18"/>
+        </w:rPr>
+        <w:t xml:space="preserve">NJM Conseil</w:t>
+      </w:r>
+    </w:p>
+    <w:p>
+      <w:pPr>
+        <w:spacing w:before="30"/>
+      </w:pPr>
+      <w:r>
+        <w:drawing>
+          <wp:inline distT="0" distB="0" distL="0" distR="0">
+            <wp:extent cx="952500" cy="666750"/>
+            <wp:effectExtent t="0" r="0" b="0" l="0"/>
+            <wp:docPr id="1" name="" descr="" title=""/>
+            <wp:cNvGraphicFramePr>
+              <a:graphicFrameLocks xmlns:a="http://schemas.openxmlformats.org/drawingml/2006/main" noChangeAspect="1"/>
+            </wp:cNvGraphicFramePr>
+            <a:graphic xmlns:a="http://schemas.openxmlformats.org/drawingml/2006/main">
+              <a:graphicData uri="http://schemas.openxmlformats.org/drawingml/2006/picture">
+                <pic:pic xmlns:pic="http://schemas.openxmlformats.org/drawingml/2006/picture">
+                  <pic:nvPicPr>
+                    <pic:cNvPr id="0" name="" descr=""/>
+                    <pic:cNvPicPr>
+                      <a:picLocks noChangeAspect="1" noChangeArrowheads="1"/>
+                    </pic:cNvPicPr>
+                  </pic:nvPicPr>
+                  <pic:blipFill>
+                    <a:blip r:embed="rId10" cstate="none"/>
+                    <a:srcRect/>
+                    <a:stretch>
+                      <a:fillRect/>
+                    </a:stretch>
+                  </pic:blipFill>
+                  <pic:spPr bwMode="auto">
+                    <a:xfrm>
+                      <a:off x="0" y="0"/>
+                      <a:ext cx="952500" cy="666750"/>
+                    </a:xfrm>
+                    <a:prstGeom prst="rect">
+                      <a:avLst/>
+                    </a:prstGeom>
+                  </pic:spPr>
+                </pic:pic>
+              </a:graphicData>
+            </a:graphic>
+          </wp:inline>
+        </w:drawing>
+      </w:r>
+    </w:p>
+    <w:p>
+      <w:pPr>
+        <w:spacing w:before="10"/>
+      </w:pPr>
+      <w:r>
+        <w:rPr>
+          <w:rFonts w:ascii="Helvetica" w:cs="Helvetica" w:eastAsia="Helvetica" w:hAnsi="Helvetica"/>
+          <w:color w:val="333333"/>
+          <w:sz w:val="18"/>
+          <w:szCs w:val="18"/>
+        </w:rPr>
+        <w:t xml:space="preserve">Nathalie Joulié Morand</w:t>
+      </w:r>
+    </w:p>
+    <w:p>
+      <w:pPr>
+        <w:spacing w:before="200"/>
         <w:jc w:val="center"/>
       </w:pPr>
       <w:r>
         <w:rPr>
-          <w:rFonts w:ascii="Arial" w:cs="Arial" w:eastAsia="Arial" w:hAnsi="Arial"/>
-          <w:color w:val="333333"/>
-          <w:sz w:val="18"/>
-          <w:szCs w:val="18"/>
-        </w:rPr>
-        <w:t xml:space="preserve">Nathalie JOULIE MORAND, gérante</w:t>
-      </w:r>
-    </w:p>
-    <w:p>
-      <w:pPr>
-        <w:jc w:val="center"/>
-      </w:pPr>
-      <w:r>
-        <w:rPr>
-          <w:rFonts w:ascii="Arial" w:cs="Arial" w:eastAsia="Arial" w:hAnsi="Arial"/>
-          <w:color w:val="333333"/>
-          <w:sz w:val="18"/>
-          <w:szCs w:val="18"/>
-        </w:rPr>
-        <w:t xml:space="preserve">NJM Conseil</w:t>
+          <w:rFonts w:ascii="Helvetica" w:cs="Helvetica" w:eastAsia="Helvetica" w:hAnsi="Helvetica"/>
+          <w:b/>
+          <w:bCs/>
+          <w:i/>
+          <w:iCs/>
+          <w:color w:val="E91E8C"/>
+          <w:sz w:val="14"/>
+          <w:szCs w:val="14"/>
+        </w:rPr>
+        <w:t xml:space="preserve">Document à conserver par le stagiaire. Aucun duplicata ne sera délivré.</w:t>
       </w:r>
     </w:p>
     <w:sectPr>
@@ -835,17 +955,20 @@
 <w:ftr xmlns:wpc="http://schemas.microsoft.com/office/word/2010/wordprocessingCanvas" xmlns:mc="http://schemas.openxmlformats.org/markup-compatibility/2006" xmlns:o="urn:schemas-microsoft-com:office:office" xmlns:r="http://schemas.openxmlformats.org/officeDocument/2006/relationships" xmlns:m="http://schemas.openxmlformats.org/officeDocument/2006/math" xmlns:v="urn:schemas-microsoft-com:vml" xmlns:wp14="http://schemas.microsoft.com/office/word/2010/wordprocessingDrawing" xmlns:wp="http://schemas.openxmlformats.org/drawingml/2006/wordprocessingDrawing" xmlns:w10="urn:schemas-microsoft-com:office:word" xmlns:w="http://schemas.openxmlformats.org/wordprocessingml/2006/main" xmlns:w14="http://schemas.microsoft.com/office/word/2010/wordml" xmlns:w15="http://schemas.microsoft.com/office/word/2012/wordml" xmlns:wpg="http://schemas.microsoft.com/office/word/2010/wordprocessingGroup" xmlns:wpi="http://schemas.microsoft.com/office/word/2010/wordprocessingInk" xmlns:wne="http://schemas.microsoft.com/office/word/2006/wordml" xmlns:wps="http://schemas.microsoft.com/office/word/2010/wordprocessingShape">
   <w:p>
     <w:pPr>
-      <w:spacing w:before="100"/>
+      <w:pBdr>
+        <w:top w:val="single" w:color="E91E8C" w:sz="6" w:space="4"/>
+      </w:pBdr>
+      <w:spacing w:before="80"/>
       <w:jc w:val="center"/>
     </w:pPr>
     <w:r>
       <w:rPr>
-        <w:rFonts w:ascii="Arial" w:cs="Arial" w:eastAsia="Arial" w:hAnsi="Arial"/>
+        <w:rFonts w:ascii="Helvetica" w:cs="Helvetica" w:eastAsia="Helvetica" w:hAnsi="Helvetica"/>
         <w:b/>
         <w:bCs/>
         <w:color w:val="7B3F9E"/>
-        <w:sz w:val="11"/>
-        <w:szCs w:val="11"/>
+        <w:sz w:val="12"/>
+        <w:szCs w:val="12"/>
       </w:rPr>
       <w:t xml:space="preserve">NJM Conseil - NATHALIE JOULIE MORAND - LE CASSAN - 12330 CLAIRVAUX D'AVEYRON - 06 88 10 40 67 - njm.conseil@orange.fr</w:t>
     </w:r>
@@ -856,10 +979,10 @@
     </w:pPr>
     <w:r>
       <w:rPr>
-        <w:rFonts w:ascii="Arial" w:cs="Arial" w:eastAsia="Arial" w:hAnsi="Arial"/>
+        <w:rFonts w:ascii="Helvetica" w:cs="Helvetica" w:eastAsia="Helvetica" w:hAnsi="Helvetica"/>
         <w:color w:val="6B7280"/>
-        <w:sz w:val="10"/>
-        <w:szCs w:val="10"/>
+        <w:sz w:val="11"/>
+        <w:szCs w:val="11"/>
       </w:rPr>
       <w:t xml:space="preserve">www.njm-conseil.fr SAS NJM Conseil au capital social de 3 000€ N°RCS Rodez 534 935 473 NAF 7022Z N° Activité : 73120063512</w:t>
     </w:r>
@@ -870,10 +993,10 @@
     </w:pPr>
     <w:r>
       <w:rPr>
-        <w:rFonts w:ascii="Arial" w:cs="Arial" w:eastAsia="Arial" w:hAnsi="Arial"/>
+        <w:rFonts w:ascii="Helvetica" w:cs="Helvetica" w:eastAsia="Helvetica" w:hAnsi="Helvetica"/>
         <w:color w:val="6B7280"/>
-        <w:sz w:val="10"/>
-        <w:szCs w:val="10"/>
+        <w:sz w:val="11"/>
+        <w:szCs w:val="11"/>
       </w:rPr>
       <w:t xml:space="preserve">Qualiopi C2-5 V2 16-11-2020</w:t>
     </w:r>
@@ -885,17 +1008,20 @@
 <w:ftr xmlns:wpc="http://schemas.microsoft.com/office/word/2010/wordprocessingCanvas" xmlns:mc="http://schemas.openxmlformats.org/markup-compatibility/2006" xmlns:o="urn:schemas-microsoft-com:office:office" xmlns:r="http://schemas.openxmlformats.org/officeDocument/2006/relationships" xmlns:m="http://schemas.openxmlformats.org/officeDocument/2006/math" xmlns:v="urn:schemas-microsoft-com:vml" xmlns:wp14="http://schemas.microsoft.com/office/word/2010/wordprocessingDrawing" xmlns:wp="http://schemas.openxmlformats.org/drawingml/2006/wordprocessingDrawing" xmlns:w10="urn:schemas-microsoft-com:office:word" xmlns:w="http://schemas.openxmlformats.org/wordprocessingml/2006/main" xmlns:w14="http://schemas.microsoft.com/office/word/2010/wordml" xmlns:w15="http://schemas.microsoft.com/office/word/2012/wordml" xmlns:wpg="http://schemas.microsoft.com/office/word/2010/wordprocessingGroup" xmlns:wpi="http://schemas.microsoft.com/office/word/2010/wordprocessingInk" xmlns:wne="http://schemas.microsoft.com/office/word/2006/wordml" xmlns:wps="http://schemas.microsoft.com/office/word/2010/wordprocessingShape">
   <w:p>
     <w:pPr>
-      <w:spacing w:before="100"/>
+      <w:pBdr>
+        <w:top w:val="single" w:color="E91E8C" w:sz="6" w:space="4"/>
+      </w:pBdr>
+      <w:spacing w:before="80"/>
       <w:jc w:val="center"/>
     </w:pPr>
     <w:r>
       <w:rPr>
-        <w:rFonts w:ascii="Arial" w:cs="Arial" w:eastAsia="Arial" w:hAnsi="Arial"/>
+        <w:rFonts w:ascii="Helvetica" w:cs="Helvetica" w:eastAsia="Helvetica" w:hAnsi="Helvetica"/>
         <w:b/>
         <w:bCs/>
         <w:color w:val="7B3F9E"/>
-        <w:sz w:val="11"/>
-        <w:szCs w:val="11"/>
+        <w:sz w:val="12"/>
+        <w:szCs w:val="12"/>
       </w:rPr>
       <w:t xml:space="preserve">NJM Conseil - NATHALIE JOULIE MORAND - LE CASSAN - 12330 CLAIRVAUX D'AVEYRON - 06 88 10 40 67 - njm.conseil@orange.fr</w:t>
     </w:r>
@@ -906,10 +1032,10 @@
     </w:pPr>
     <w:r>
       <w:rPr>
-        <w:rFonts w:ascii="Arial" w:cs="Arial" w:eastAsia="Arial" w:hAnsi="Arial"/>
+        <w:rFonts w:ascii="Helvetica" w:cs="Helvetica" w:eastAsia="Helvetica" w:hAnsi="Helvetica"/>
         <w:color w:val="6B7280"/>
-        <w:sz w:val="10"/>
-        <w:szCs w:val="10"/>
+        <w:sz w:val="11"/>
+        <w:szCs w:val="11"/>
       </w:rPr>
       <w:t xml:space="preserve">www.njm-conseil.fr SAS NJM Conseil au capital social de 3 000€ N°RCS Rodez 534 935 473 NAF 7022Z N° Activité : 73120063512</w:t>
     </w:r>
@@ -920,10 +1046,10 @@
     </w:pPr>
     <w:r>
       <w:rPr>
-        <w:rFonts w:ascii="Arial" w:cs="Arial" w:eastAsia="Arial" w:hAnsi="Arial"/>
+        <w:rFonts w:ascii="Helvetica" w:cs="Helvetica" w:eastAsia="Helvetica" w:hAnsi="Helvetica"/>
         <w:color w:val="6B7280"/>
-        <w:sz w:val="10"/>
-        <w:szCs w:val="10"/>
+        <w:sz w:val="11"/>
+        <w:szCs w:val="11"/>
       </w:rPr>
       <w:t xml:space="preserve">Qualiopi C2-5 V2 16-11-2020</w:t>
     </w:r>

</xml_diff>

<commit_message>
fix: corrections documents cliente — learner_name, logo, cachet, retours ligne, heures/jour
- Fix {{learner_name}} non remplace dans certificat DOCX
- Logo plus grand (140x81) + cachet plus grand (150x110) dans templates
- Retours a la ligne \n convertis en <w:br/> dans les DOCX
- Heures/jour = total / nb jours dans feuille de presence

Co-Authored-By: Claude Opus 4.6 (1M context) <noreply@anthropic.com>
</commit_message>
<xml_diff>
--- a/templates/attestation_template.docx
+++ b/templates/attestation_template.docx
@@ -6,7 +6,7 @@
       <w:r>
         <w:drawing>
           <wp:inline distT="0" distB="0" distL="0" distR="0">
-            <wp:extent cx="952500" cy="552450"/>
+            <wp:extent cx="1333500" cy="771525"/>
             <wp:effectExtent t="0" r="0" b="0" l="0"/>
             <wp:docPr id="1" name="" descr="" title=""/>
             <wp:cNvGraphicFramePr>
@@ -31,7 +31,7 @@
                   <pic:spPr bwMode="auto">
                     <a:xfrm>
                       <a:off x="0" y="0"/>
-                      <a:ext cx="952500" cy="552450"/>
+                      <a:ext cx="1333500" cy="771525"/>
                     </a:xfrm>
                     <a:prstGeom prst="rect">
                       <a:avLst/>
@@ -378,7 +378,7 @@
       <w:r>
         <w:drawing>
           <wp:inline distT="0" distB="0" distL="0" distR="0">
-            <wp:extent cx="952500" cy="552450"/>
+            <wp:extent cx="1333500" cy="771525"/>
             <wp:effectExtent t="0" r="0" b="0" l="0"/>
             <wp:docPr id="1" name="" descr="" title=""/>
             <wp:cNvGraphicFramePr>
@@ -403,7 +403,7 @@
                   <pic:spPr bwMode="auto">
                     <a:xfrm>
                       <a:off x="0" y="0"/>
-                      <a:ext cx="952500" cy="552450"/>
+                      <a:ext cx="1333500" cy="771525"/>
                     </a:xfrm>
                     <a:prstGeom prst="rect">
                       <a:avLst/>

</xml_diff>

<commit_message>
feat: header DOCX logo+activites cote a cote + stockage DOCX dans Supabase
- Header DOCX : tableau invisible 2 colonnes (logo gauche, activites droite)
- DOCX uploade dans Supabase Storage bucket 'documents' a chaque telechargement
- URL publique sauvegardee dans formation_documents pour retrouver le fichier
- Fallback sur reference generate:// si upload echoue

Co-Authored-By: Claude Opus 4.6 (1M context) <noreply@anthropic.com>
</commit_message>
<xml_diff>
--- a/templates/attestation_template.docx
+++ b/templates/attestation_template.docx
@@ -2,129 +2,174 @@
 <file path=word/document.xml><?xml version="1.0" encoding="utf-8"?>
 <w:document xmlns:wpc="http://schemas.microsoft.com/office/word/2010/wordprocessingCanvas" xmlns:mc="http://schemas.openxmlformats.org/markup-compatibility/2006" xmlns:o="urn:schemas-microsoft-com:office:office" xmlns:r="http://schemas.openxmlformats.org/officeDocument/2006/relationships" xmlns:m="http://schemas.openxmlformats.org/officeDocument/2006/math" xmlns:v="urn:schemas-microsoft-com:vml" xmlns:wp14="http://schemas.microsoft.com/office/word/2010/wordprocessingDrawing" xmlns:wp="http://schemas.openxmlformats.org/drawingml/2006/wordprocessingDrawing" xmlns:w10="urn:schemas-microsoft-com:office:word" xmlns:w="http://schemas.openxmlformats.org/wordprocessingml/2006/main" xmlns:w14="http://schemas.microsoft.com/office/word/2010/wordml" xmlns:w15="http://schemas.microsoft.com/office/word/2012/wordml" xmlns:wpg="http://schemas.microsoft.com/office/word/2010/wordprocessingGroup" xmlns:wpi="http://schemas.microsoft.com/office/word/2010/wordprocessingInk" xmlns:wne="http://schemas.microsoft.com/office/word/2006/wordml" xmlns:wps="http://schemas.microsoft.com/office/word/2010/wordprocessingShape" xmlns:cx="http://schemas.microsoft.com/office/drawing/2014/chartex" xmlns:cx1="http://schemas.microsoft.com/office/drawing/2015/9/8/chartex" xmlns:cx2="http://schemas.microsoft.com/office/drawing/2015/10/21/chartex" xmlns:cx3="http://schemas.microsoft.com/office/drawing/2016/5/9/chartex" xmlns:cx4="http://schemas.microsoft.com/office/drawing/2016/5/10/chartex" xmlns:cx5="http://schemas.microsoft.com/office/drawing/2016/5/11/chartex" xmlns:cx6="http://schemas.microsoft.com/office/drawing/2016/5/12/chartex" xmlns:cx7="http://schemas.microsoft.com/office/drawing/2016/5/13/chartex" xmlns:cx8="http://schemas.microsoft.com/office/drawing/2016/5/14/chartex" xmlns:aink="http://schemas.microsoft.com/office/drawing/2016/ink" xmlns:am3d="http://schemas.microsoft.com/office/drawing/2017/model3d" xmlns:w16cex="http://schemas.microsoft.com/office/word/2018/wordml/cex" xmlns:w16cid="http://schemas.microsoft.com/office/word/2016/wordml/cid" xmlns:w16="http://schemas.microsoft.com/office/word/2018/wordml" xmlns:w16sdtdh="http://schemas.microsoft.com/office/word/2020/wordml/sdtdatahash" xmlns:w16se="http://schemas.microsoft.com/office/word/2015/wordml/symex" mc:Ignorable="w14 w15 wp14">
   <w:body>
-    <w:p>
-      <w:r>
-        <w:drawing>
-          <wp:inline distT="0" distB="0" distL="0" distR="0">
-            <wp:extent cx="1333500" cy="771525"/>
-            <wp:effectExtent t="0" r="0" b="0" l="0"/>
-            <wp:docPr id="1" name="" descr="" title=""/>
-            <wp:cNvGraphicFramePr>
-              <a:graphicFrameLocks xmlns:a="http://schemas.openxmlformats.org/drawingml/2006/main" noChangeAspect="1"/>
-            </wp:cNvGraphicFramePr>
-            <a:graphic xmlns:a="http://schemas.openxmlformats.org/drawingml/2006/main">
-              <a:graphicData uri="http://schemas.openxmlformats.org/drawingml/2006/picture">
-                <pic:pic xmlns:pic="http://schemas.openxmlformats.org/drawingml/2006/picture">
-                  <pic:nvPicPr>
-                    <pic:cNvPr id="0" name="" descr=""/>
-                    <pic:cNvPicPr>
-                      <a:picLocks noChangeAspect="1" noChangeArrowheads="1"/>
-                    </pic:cNvPicPr>
-                  </pic:nvPicPr>
-                  <pic:blipFill>
-                    <a:blip r:embed="rId9" cstate="none"/>
-                    <a:srcRect/>
-                    <a:stretch>
-                      <a:fillRect/>
-                    </a:stretch>
-                  </pic:blipFill>
-                  <pic:spPr bwMode="auto">
-                    <a:xfrm>
-                      <a:off x="0" y="0"/>
-                      <a:ext cx="1333500" cy="771525"/>
-                    </a:xfrm>
-                    <a:prstGeom prst="rect">
-                      <a:avLst/>
-                    </a:prstGeom>
-                  </pic:spPr>
-                </pic:pic>
-              </a:graphicData>
-            </a:graphic>
-          </wp:inline>
-        </w:drawing>
-      </w:r>
-    </w:p>
-    <w:p>
-      <w:pPr>
-        <w:spacing w:before="0"/>
-        <w:jc w:val="right"/>
-      </w:pPr>
-      <w:r>
-        <w:rPr>
-          <w:rFonts w:ascii="Helvetica" w:cs="Helvetica" w:eastAsia="Helvetica" w:hAnsi="Helvetica"/>
-          <w:b/>
-          <w:bCs/>
-          <w:color w:val="E36A3A"/>
-          <w:sz w:val="13"/>
-          <w:szCs w:val="13"/>
-        </w:rPr>
-        <w:t xml:space="preserve">MARKETING</w:t>
-      </w:r>
-    </w:p>
-    <w:p>
-      <w:pPr>
-        <w:jc w:val="right"/>
-      </w:pPr>
-      <w:r>
-        <w:rPr>
-          <w:rFonts w:ascii="Helvetica" w:cs="Helvetica" w:eastAsia="Helvetica" w:hAnsi="Helvetica"/>
-          <w:b/>
-          <w:bCs/>
-          <w:color w:val="E36A3A"/>
-          <w:sz w:val="13"/>
-          <w:szCs w:val="13"/>
-        </w:rPr>
-        <w:t xml:space="preserve">WEB MARKETING</w:t>
-      </w:r>
-    </w:p>
-    <w:p>
-      <w:pPr>
-        <w:jc w:val="right"/>
-      </w:pPr>
-      <w:r>
-        <w:rPr>
-          <w:rFonts w:ascii="Helvetica" w:cs="Helvetica" w:eastAsia="Helvetica" w:hAnsi="Helvetica"/>
-          <w:b/>
-          <w:bCs/>
-          <w:color w:val="E36A3A"/>
-          <w:sz w:val="13"/>
-          <w:szCs w:val="13"/>
-        </w:rPr>
-        <w:t xml:space="preserve">COMMERCIAL</w:t>
-      </w:r>
-    </w:p>
-    <w:p>
-      <w:pPr>
-        <w:jc w:val="right"/>
-      </w:pPr>
-      <w:r>
-        <w:rPr>
-          <w:rFonts w:ascii="Helvetica" w:cs="Helvetica" w:eastAsia="Helvetica" w:hAnsi="Helvetica"/>
-          <w:b/>
-          <w:bCs/>
-          <w:color w:val="E36A3A"/>
-          <w:sz w:val="13"/>
-          <w:szCs w:val="13"/>
-        </w:rPr>
-        <w:t xml:space="preserve">COMMUNICATION</w:t>
-      </w:r>
-    </w:p>
-    <w:p>
-      <w:pPr>
-        <w:spacing w:after="150"/>
-        <w:jc w:val="right"/>
-      </w:pPr>
-      <w:r>
-        <w:rPr>
-          <w:rFonts w:ascii="Helvetica" w:cs="Helvetica" w:eastAsia="Helvetica" w:hAnsi="Helvetica"/>
-          <w:b/>
-          <w:bCs/>
-          <w:color w:val="E36A3A"/>
-          <w:sz w:val="13"/>
-          <w:szCs w:val="13"/>
-        </w:rPr>
-        <w:t xml:space="preserve">COACHING</w:t>
-      </w:r>
+    <w:tbl>
+      <w:tblPr>
+        <w:tblW w:type="dxa" w:w="9500"/>
+        <w:tblBorders>
+          <w:top w:val="none" w:sz="0"/>
+          <w:left w:val="none" w:sz="0"/>
+          <w:bottom w:val="none" w:sz="0"/>
+          <w:right w:val="none" w:sz="0"/>
+          <w:insideH w:val="none" w:sz="0"/>
+          <w:insideV w:val="none" w:sz="0"/>
+        </w:tblBorders>
+      </w:tblPr>
+      <w:tblGrid>
+        <w:gridCol w:w="100"/>
+        <w:gridCol w:w="100"/>
+      </w:tblGrid>
+      <w:tr>
+        <w:tc>
+          <w:tcPr>
+            <w:tcW w:type="dxa" w:w="4000"/>
+            <w:tcBorders>
+              <w:top w:val="none" w:sz="0"/>
+              <w:left w:val="none" w:sz="0"/>
+              <w:bottom w:val="none" w:sz="0"/>
+              <w:right w:val="none" w:sz="0"/>
+            </w:tcBorders>
+          </w:tcPr>
+          <w:p>
+            <w:r>
+              <w:drawing>
+                <wp:inline distT="0" distB="0" distL="0" distR="0">
+                  <wp:extent cx="1333500" cy="771525"/>
+                  <wp:effectExtent t="0" r="0" b="0" l="0"/>
+                  <wp:docPr id="1" name="" descr="" title=""/>
+                  <wp:cNvGraphicFramePr>
+                    <a:graphicFrameLocks xmlns:a="http://schemas.openxmlformats.org/drawingml/2006/main" noChangeAspect="1"/>
+                  </wp:cNvGraphicFramePr>
+                  <a:graphic xmlns:a="http://schemas.openxmlformats.org/drawingml/2006/main">
+                    <a:graphicData uri="http://schemas.openxmlformats.org/drawingml/2006/picture">
+                      <pic:pic xmlns:pic="http://schemas.openxmlformats.org/drawingml/2006/picture">
+                        <pic:nvPicPr>
+                          <pic:cNvPr id="0" name="" descr=""/>
+                          <pic:cNvPicPr>
+                            <a:picLocks noChangeAspect="1" noChangeArrowheads="1"/>
+                          </pic:cNvPicPr>
+                        </pic:nvPicPr>
+                        <pic:blipFill>
+                          <a:blip r:embed="rId9" cstate="none"/>
+                          <a:srcRect/>
+                          <a:stretch>
+                            <a:fillRect/>
+                          </a:stretch>
+                        </pic:blipFill>
+                        <pic:spPr bwMode="auto">
+                          <a:xfrm>
+                            <a:off x="0" y="0"/>
+                            <a:ext cx="1333500" cy="771525"/>
+                          </a:xfrm>
+                          <a:prstGeom prst="rect">
+                            <a:avLst/>
+                          </a:prstGeom>
+                        </pic:spPr>
+                      </pic:pic>
+                    </a:graphicData>
+                  </a:graphic>
+                </wp:inline>
+              </w:drawing>
+            </w:r>
+          </w:p>
+        </w:tc>
+        <w:tc>
+          <w:tcPr>
+            <w:tcW w:type="dxa" w:w="5500"/>
+            <w:tcBorders>
+              <w:top w:val="none" w:sz="0"/>
+              <w:left w:val="none" w:sz="0"/>
+              <w:bottom w:val="none" w:sz="0"/>
+              <w:right w:val="none" w:sz="0"/>
+            </w:tcBorders>
+            <w:vAlign w:val="top"/>
+          </w:tcPr>
+          <w:p>
+            <w:pPr>
+              <w:jc w:val="right"/>
+            </w:pPr>
+            <w:r>
+              <w:rPr>
+                <w:rFonts w:ascii="Helvetica" w:cs="Helvetica" w:eastAsia="Helvetica" w:hAnsi="Helvetica"/>
+                <w:b/>
+                <w:bCs/>
+                <w:color w:val="E36A3A"/>
+                <w:sz w:val="13"/>
+                <w:szCs w:val="13"/>
+              </w:rPr>
+              <w:t xml:space="preserve">MARKETING</w:t>
+            </w:r>
+          </w:p>
+          <w:p>
+            <w:pPr>
+              <w:jc w:val="right"/>
+            </w:pPr>
+            <w:r>
+              <w:rPr>
+                <w:rFonts w:ascii="Helvetica" w:cs="Helvetica" w:eastAsia="Helvetica" w:hAnsi="Helvetica"/>
+                <w:b/>
+                <w:bCs/>
+                <w:color w:val="E36A3A"/>
+                <w:sz w:val="13"/>
+                <w:szCs w:val="13"/>
+              </w:rPr>
+              <w:t xml:space="preserve">WEB MARKETING</w:t>
+            </w:r>
+          </w:p>
+          <w:p>
+            <w:pPr>
+              <w:jc w:val="right"/>
+            </w:pPr>
+            <w:r>
+              <w:rPr>
+                <w:rFonts w:ascii="Helvetica" w:cs="Helvetica" w:eastAsia="Helvetica" w:hAnsi="Helvetica"/>
+                <w:b/>
+                <w:bCs/>
+                <w:color w:val="E36A3A"/>
+                <w:sz w:val="13"/>
+                <w:szCs w:val="13"/>
+              </w:rPr>
+              <w:t xml:space="preserve">COMMERCIAL</w:t>
+            </w:r>
+          </w:p>
+          <w:p>
+            <w:pPr>
+              <w:jc w:val="right"/>
+            </w:pPr>
+            <w:r>
+              <w:rPr>
+                <w:rFonts w:ascii="Helvetica" w:cs="Helvetica" w:eastAsia="Helvetica" w:hAnsi="Helvetica"/>
+                <w:b/>
+                <w:bCs/>
+                <w:color w:val="E36A3A"/>
+                <w:sz w:val="13"/>
+                <w:szCs w:val="13"/>
+              </w:rPr>
+              <w:t xml:space="preserve">COMMUNICATION</w:t>
+            </w:r>
+          </w:p>
+          <w:p>
+            <w:pPr>
+              <w:jc w:val="right"/>
+            </w:pPr>
+            <w:r>
+              <w:rPr>
+                <w:rFonts w:ascii="Helvetica" w:cs="Helvetica" w:eastAsia="Helvetica" w:hAnsi="Helvetica"/>
+                <w:b/>
+                <w:bCs/>
+                <w:color w:val="E36A3A"/>
+                <w:sz w:val="13"/>
+                <w:szCs w:val="13"/>
+              </w:rPr>
+              <w:t xml:space="preserve">COACHING</w:t>
+            </w:r>
+          </w:p>
+        </w:tc>
+      </w:tr>
+    </w:tbl>
+    <w:p>
+      <w:pPr>
+        <w:spacing w:after="80"/>
+      </w:pPr>
     </w:p>
     <w:p>
       <w:pPr>
@@ -374,129 +419,174 @@
         </w:sectPr>
       </w:pPr>
     </w:p>
-    <w:p>
-      <w:r>
-        <w:drawing>
-          <wp:inline distT="0" distB="0" distL="0" distR="0">
-            <wp:extent cx="1333500" cy="771525"/>
-            <wp:effectExtent t="0" r="0" b="0" l="0"/>
-            <wp:docPr id="1" name="" descr="" title=""/>
-            <wp:cNvGraphicFramePr>
-              <a:graphicFrameLocks xmlns:a="http://schemas.openxmlformats.org/drawingml/2006/main" noChangeAspect="1"/>
-            </wp:cNvGraphicFramePr>
-            <a:graphic xmlns:a="http://schemas.openxmlformats.org/drawingml/2006/main">
-              <a:graphicData uri="http://schemas.openxmlformats.org/drawingml/2006/picture">
-                <pic:pic xmlns:pic="http://schemas.openxmlformats.org/drawingml/2006/picture">
-                  <pic:nvPicPr>
-                    <pic:cNvPr id="0" name="" descr=""/>
-                    <pic:cNvPicPr>
-                      <a:picLocks noChangeAspect="1" noChangeArrowheads="1"/>
-                    </pic:cNvPicPr>
-                  </pic:nvPicPr>
-                  <pic:blipFill>
-                    <a:blip r:embed="rId9" cstate="none"/>
-                    <a:srcRect/>
-                    <a:stretch>
-                      <a:fillRect/>
-                    </a:stretch>
-                  </pic:blipFill>
-                  <pic:spPr bwMode="auto">
-                    <a:xfrm>
-                      <a:off x="0" y="0"/>
-                      <a:ext cx="1333500" cy="771525"/>
-                    </a:xfrm>
-                    <a:prstGeom prst="rect">
-                      <a:avLst/>
-                    </a:prstGeom>
-                  </pic:spPr>
-                </pic:pic>
-              </a:graphicData>
-            </a:graphic>
-          </wp:inline>
-        </w:drawing>
-      </w:r>
-    </w:p>
-    <w:p>
-      <w:pPr>
-        <w:spacing w:before="0"/>
-        <w:jc w:val="right"/>
-      </w:pPr>
-      <w:r>
-        <w:rPr>
-          <w:rFonts w:ascii="Helvetica" w:cs="Helvetica" w:eastAsia="Helvetica" w:hAnsi="Helvetica"/>
-          <w:b/>
-          <w:bCs/>
-          <w:color w:val="E36A3A"/>
-          <w:sz w:val="13"/>
-          <w:szCs w:val="13"/>
-        </w:rPr>
-        <w:t xml:space="preserve">MARKETING</w:t>
-      </w:r>
-    </w:p>
-    <w:p>
-      <w:pPr>
-        <w:jc w:val="right"/>
-      </w:pPr>
-      <w:r>
-        <w:rPr>
-          <w:rFonts w:ascii="Helvetica" w:cs="Helvetica" w:eastAsia="Helvetica" w:hAnsi="Helvetica"/>
-          <w:b/>
-          <w:bCs/>
-          <w:color w:val="E36A3A"/>
-          <w:sz w:val="13"/>
-          <w:szCs w:val="13"/>
-        </w:rPr>
-        <w:t xml:space="preserve">WEB MARKETING</w:t>
-      </w:r>
-    </w:p>
-    <w:p>
-      <w:pPr>
-        <w:jc w:val="right"/>
-      </w:pPr>
-      <w:r>
-        <w:rPr>
-          <w:rFonts w:ascii="Helvetica" w:cs="Helvetica" w:eastAsia="Helvetica" w:hAnsi="Helvetica"/>
-          <w:b/>
-          <w:bCs/>
-          <w:color w:val="E36A3A"/>
-          <w:sz w:val="13"/>
-          <w:szCs w:val="13"/>
-        </w:rPr>
-        <w:t xml:space="preserve">COMMERCIAL</w:t>
-      </w:r>
-    </w:p>
-    <w:p>
-      <w:pPr>
-        <w:jc w:val="right"/>
-      </w:pPr>
-      <w:r>
-        <w:rPr>
-          <w:rFonts w:ascii="Helvetica" w:cs="Helvetica" w:eastAsia="Helvetica" w:hAnsi="Helvetica"/>
-          <w:b/>
-          <w:bCs/>
-          <w:color w:val="E36A3A"/>
-          <w:sz w:val="13"/>
-          <w:szCs w:val="13"/>
-        </w:rPr>
-        <w:t xml:space="preserve">COMMUNICATION</w:t>
-      </w:r>
-    </w:p>
-    <w:p>
-      <w:pPr>
-        <w:spacing w:after="150"/>
-        <w:jc w:val="right"/>
-      </w:pPr>
-      <w:r>
-        <w:rPr>
-          <w:rFonts w:ascii="Helvetica" w:cs="Helvetica" w:eastAsia="Helvetica" w:hAnsi="Helvetica"/>
-          <w:b/>
-          <w:bCs/>
-          <w:color w:val="E36A3A"/>
-          <w:sz w:val="13"/>
-          <w:szCs w:val="13"/>
-        </w:rPr>
-        <w:t xml:space="preserve">COACHING</w:t>
-      </w:r>
+    <w:tbl>
+      <w:tblPr>
+        <w:tblW w:type="dxa" w:w="9500"/>
+        <w:tblBorders>
+          <w:top w:val="none" w:sz="0"/>
+          <w:left w:val="none" w:sz="0"/>
+          <w:bottom w:val="none" w:sz="0"/>
+          <w:right w:val="none" w:sz="0"/>
+          <w:insideH w:val="none" w:sz="0"/>
+          <w:insideV w:val="none" w:sz="0"/>
+        </w:tblBorders>
+      </w:tblPr>
+      <w:tblGrid>
+        <w:gridCol w:w="100"/>
+        <w:gridCol w:w="100"/>
+      </w:tblGrid>
+      <w:tr>
+        <w:tc>
+          <w:tcPr>
+            <w:tcW w:type="dxa" w:w="4000"/>
+            <w:tcBorders>
+              <w:top w:val="none" w:sz="0"/>
+              <w:left w:val="none" w:sz="0"/>
+              <w:bottom w:val="none" w:sz="0"/>
+              <w:right w:val="none" w:sz="0"/>
+            </w:tcBorders>
+          </w:tcPr>
+          <w:p>
+            <w:r>
+              <w:drawing>
+                <wp:inline distT="0" distB="0" distL="0" distR="0">
+                  <wp:extent cx="1333500" cy="771525"/>
+                  <wp:effectExtent t="0" r="0" b="0" l="0"/>
+                  <wp:docPr id="1" name="" descr="" title=""/>
+                  <wp:cNvGraphicFramePr>
+                    <a:graphicFrameLocks xmlns:a="http://schemas.openxmlformats.org/drawingml/2006/main" noChangeAspect="1"/>
+                  </wp:cNvGraphicFramePr>
+                  <a:graphic xmlns:a="http://schemas.openxmlformats.org/drawingml/2006/main">
+                    <a:graphicData uri="http://schemas.openxmlformats.org/drawingml/2006/picture">
+                      <pic:pic xmlns:pic="http://schemas.openxmlformats.org/drawingml/2006/picture">
+                        <pic:nvPicPr>
+                          <pic:cNvPr id="0" name="" descr=""/>
+                          <pic:cNvPicPr>
+                            <a:picLocks noChangeAspect="1" noChangeArrowheads="1"/>
+                          </pic:cNvPicPr>
+                        </pic:nvPicPr>
+                        <pic:blipFill>
+                          <a:blip r:embed="rId9" cstate="none"/>
+                          <a:srcRect/>
+                          <a:stretch>
+                            <a:fillRect/>
+                          </a:stretch>
+                        </pic:blipFill>
+                        <pic:spPr bwMode="auto">
+                          <a:xfrm>
+                            <a:off x="0" y="0"/>
+                            <a:ext cx="1333500" cy="771525"/>
+                          </a:xfrm>
+                          <a:prstGeom prst="rect">
+                            <a:avLst/>
+                          </a:prstGeom>
+                        </pic:spPr>
+                      </pic:pic>
+                    </a:graphicData>
+                  </a:graphic>
+                </wp:inline>
+              </w:drawing>
+            </w:r>
+          </w:p>
+        </w:tc>
+        <w:tc>
+          <w:tcPr>
+            <w:tcW w:type="dxa" w:w="5500"/>
+            <w:tcBorders>
+              <w:top w:val="none" w:sz="0"/>
+              <w:left w:val="none" w:sz="0"/>
+              <w:bottom w:val="none" w:sz="0"/>
+              <w:right w:val="none" w:sz="0"/>
+            </w:tcBorders>
+            <w:vAlign w:val="top"/>
+          </w:tcPr>
+          <w:p>
+            <w:pPr>
+              <w:jc w:val="right"/>
+            </w:pPr>
+            <w:r>
+              <w:rPr>
+                <w:rFonts w:ascii="Helvetica" w:cs="Helvetica" w:eastAsia="Helvetica" w:hAnsi="Helvetica"/>
+                <w:b/>
+                <w:bCs/>
+                <w:color w:val="E36A3A"/>
+                <w:sz w:val="13"/>
+                <w:szCs w:val="13"/>
+              </w:rPr>
+              <w:t xml:space="preserve">MARKETING</w:t>
+            </w:r>
+          </w:p>
+          <w:p>
+            <w:pPr>
+              <w:jc w:val="right"/>
+            </w:pPr>
+            <w:r>
+              <w:rPr>
+                <w:rFonts w:ascii="Helvetica" w:cs="Helvetica" w:eastAsia="Helvetica" w:hAnsi="Helvetica"/>
+                <w:b/>
+                <w:bCs/>
+                <w:color w:val="E36A3A"/>
+                <w:sz w:val="13"/>
+                <w:szCs w:val="13"/>
+              </w:rPr>
+              <w:t xml:space="preserve">WEB MARKETING</w:t>
+            </w:r>
+          </w:p>
+          <w:p>
+            <w:pPr>
+              <w:jc w:val="right"/>
+            </w:pPr>
+            <w:r>
+              <w:rPr>
+                <w:rFonts w:ascii="Helvetica" w:cs="Helvetica" w:eastAsia="Helvetica" w:hAnsi="Helvetica"/>
+                <w:b/>
+                <w:bCs/>
+                <w:color w:val="E36A3A"/>
+                <w:sz w:val="13"/>
+                <w:szCs w:val="13"/>
+              </w:rPr>
+              <w:t xml:space="preserve">COMMERCIAL</w:t>
+            </w:r>
+          </w:p>
+          <w:p>
+            <w:pPr>
+              <w:jc w:val="right"/>
+            </w:pPr>
+            <w:r>
+              <w:rPr>
+                <w:rFonts w:ascii="Helvetica" w:cs="Helvetica" w:eastAsia="Helvetica" w:hAnsi="Helvetica"/>
+                <w:b/>
+                <w:bCs/>
+                <w:color w:val="E36A3A"/>
+                <w:sz w:val="13"/>
+                <w:szCs w:val="13"/>
+              </w:rPr>
+              <w:t xml:space="preserve">COMMUNICATION</w:t>
+            </w:r>
+          </w:p>
+          <w:p>
+            <w:pPr>
+              <w:jc w:val="right"/>
+            </w:pPr>
+            <w:r>
+              <w:rPr>
+                <w:rFonts w:ascii="Helvetica" w:cs="Helvetica" w:eastAsia="Helvetica" w:hAnsi="Helvetica"/>
+                <w:b/>
+                <w:bCs/>
+                <w:color w:val="E36A3A"/>
+                <w:sz w:val="13"/>
+                <w:szCs w:val="13"/>
+              </w:rPr>
+              <w:t xml:space="preserve">COACHING</w:t>
+            </w:r>
+          </w:p>
+        </w:tc>
+      </w:tr>
+    </w:tbl>
+    <w:p>
+      <w:pPr>
+        <w:spacing w:after="80"/>
+      </w:pPr>
     </w:p>
     <w:p>
       <w:pPr>

</xml_diff>